<commit_message>
Précisions flux 3 : Ajouter PDF hors de la boucle, nomFichier du déclencheur ; nom de la colonne des pièces jointes
Co-Authored-By: Claude Opus 5.5 <noreply@anthropic.com>
Claude-Session: https://claude.ai/code/session_01FRdAzq8p3F9gJJe5MA3G79
</commit_message>
<xml_diff>
--- a/powerapps/MISE-A-JOUR-28-OCTOBRE.docx
+++ b/powerapps/MISE-A-JOUR-28-OCTOBRE.docx
@@ -1352,7 +1352,39 @@
         <w:t xml:space="preserve"> </w:t>
       </w:r>
       <w:r>
-        <w:t xml:space="preserve">(contenu dynamique), puis tapez</w:t>
+        <w:t xml:space="preserve">du</w:t>
+      </w:r>
+      <w:r>
+        <w:t xml:space="preserve"> </w:t>
+      </w:r>
+      <w:r>
+        <w:rPr>
+          <w:bCs/>
+          <w:b/>
+        </w:rPr>
+        <w:t xml:space="preserve">déclencheur Power Apps</w:t>
+      </w:r>
+      <w:r>
+        <w:t xml:space="preserve"> </w:t>
+      </w:r>
+      <w:r>
+        <w:t xml:space="preserve">(icône mauve,</w:t>
+      </w:r>
+      <w:r>
+        <w:t xml:space="preserve"> </w:t>
+      </w:r>
+      <w:r>
+        <w:rPr>
+          <w:bCs/>
+          <w:b/>
+        </w:rPr>
+        <w:t xml:space="preserve">pas</w:t>
+      </w:r>
+      <w:r>
+        <w:t xml:space="preserve"> </w:t>
+      </w:r>
+      <w:r>
+        <w:t xml:space="preserve">« Nom de fichier » de OneDrive, qui se termine par .html), puis tapez</w:t>
       </w:r>
       <w:r>
         <w:t xml:space="preserve"> </w:t>
@@ -1485,7 +1517,39 @@
         <w:t xml:space="preserve"> </w:t>
       </w:r>
       <w:r>
-        <w:t xml:space="preserve">— sous la boucle, pas dedans ; renommez-la</w:t>
+        <w:t xml:space="preserve">—</w:t>
+      </w:r>
+      <w:r>
+        <w:t xml:space="preserve"> </w:t>
+      </w:r>
+      <w:r>
+        <w:rPr>
+          <w:bCs/>
+          <w:b/>
+        </w:rPr>
+        <w:t xml:space="preserve">SOUS la boucle, à l’extérieur</w:t>
+      </w:r>
+      <w:r>
+        <w:t xml:space="preserve"> </w:t>
+      </w:r>
+      <w:r>
+        <w:t xml:space="preserve">(utilisez le « + » de la flèche</w:t>
+      </w:r>
+      <w:r>
+        <w:t xml:space="preserve"> </w:t>
+      </w:r>
+      <w:r>
+        <w:rPr>
+          <w:iCs/>
+          <w:i/>
+        </w:rPr>
+        <w:t xml:space="preserve">sous</w:t>
+      </w:r>
+      <w:r>
+        <w:t xml:space="preserve"> </w:t>
+      </w:r>
+      <w:r>
+        <w:t xml:space="preserve">la carte « Anciennes versions », pas le « Ajouter une action » à l’intérieur) ; renommez-la</w:t>
       </w:r>
       <w:r>
         <w:t xml:space="preserve"> </w:t>
@@ -1553,7 +1617,10 @@
         <w:t xml:space="preserve">nomFichier</w:t>
       </w:r>
       <w:r>
-        <w:t xml:space="preserve">, puis tapez</w:t>
+        <w:t xml:space="preserve"> </w:t>
+      </w:r>
+      <w:r>
+        <w:t xml:space="preserve">du déclencheur Power Apps (icône mauve), puis tapez</w:t>
       </w:r>
       <w:r>
         <w:t xml:space="preserve"> </w:t>
@@ -1563,6 +1630,12 @@
           <w:rStyle w:val="VerbatimChar"/>
         </w:rPr>
         <w:t xml:space="preserve">.pdf</w:t>
+      </w:r>
+      <w:r>
+        <w:t xml:space="preserve"> </w:t>
+      </w:r>
+      <w:r>
+        <w:t xml:space="preserve">(avec le point)</w:t>
       </w:r>
     </w:p>
     <w:p>
@@ -2689,6 +2762,83 @@
           <w:rStyle w:val="VerbatimChar"/>
         </w:rPr>
         <w:t xml:space="preserve">!IsEmpty(Filter(ThisItem.Attachments; EndsWith(DisplayName; ".pdf")))</w:t>
+      </w:r>
+    </w:p>
+    <w:p>
+      <w:pPr>
+        <w:pStyle w:val="BlockText"/>
+      </w:pPr>
+      <w:r>
+        <w:t xml:space="preserve">Si</w:t>
+      </w:r>
+      <w:r>
+        <w:t xml:space="preserve"> </w:t>
+      </w:r>
+      <w:r>
+        <w:rPr>
+          <w:rStyle w:val="VerbatimChar"/>
+        </w:rPr>
+        <w:t xml:space="preserve">Attachments</w:t>
+      </w:r>
+      <w:r>
+        <w:t xml:space="preserve"> </w:t>
+      </w:r>
+      <w:r>
+        <w:t xml:space="preserve">est souligné en rouge : effacez</w:t>
+      </w:r>
+      <w:r>
+        <w:t xml:space="preserve"> </w:t>
+      </w:r>
+      <w:r>
+        <w:rPr>
+          <w:rStyle w:val="VerbatimChar"/>
+        </w:rPr>
+        <w:t xml:space="preserve">Attachments</w:t>
+      </w:r>
+      <w:r>
+        <w:t xml:space="preserve">, tapez</w:t>
+      </w:r>
+      <w:r>
+        <w:t xml:space="preserve"> </w:t>
+      </w:r>
+      <w:r>
+        <w:rPr>
+          <w:rStyle w:val="VerbatimChar"/>
+        </w:rPr>
+        <w:t xml:space="preserve">ThisItem.</w:t>
+      </w:r>
+      <w:r>
+        <w:t xml:space="preserve"> </w:t>
+      </w:r>
+      <w:r>
+        <w:t xml:space="preserve">et choisissez la colonne des pièces jointes proposée par Power Apps (en français, elle peut s’appeler</w:t>
+      </w:r>
+      <w:r>
+        <w:t xml:space="preserve"> </w:t>
+      </w:r>
+      <w:r>
+        <w:rPr>
+          <w:bCs/>
+          <w:b/>
+        </w:rPr>
+        <w:t xml:space="preserve">‘</w:t>
+      </w:r>
+      <w:r>
+        <w:rPr>
+          <w:bCs/>
+          <w:b/>
+        </w:rPr>
+        <w:t xml:space="preserve">Pièces jointes</w:t>
+      </w:r>
+      <w:r>
+        <w:rPr>
+          <w:bCs/>
+          <w:b/>
+        </w:rPr>
+        <w:t xml:space="preserve">’</w:t>
+      </w:r>
+      <w:r>
+        <w:t xml:space="preserve">). Faites la même chose dans OnSelect.</w:t>
       </w:r>
     </w:p>
     <w:p>

</xml_diff>